<commit_message>
PC: Ajuste de las plantillas y act de programación paralela y en tiempo real
</commit_message>
<xml_diff>
--- a/TAREAS 6 SEMESTRE/.Recursos/PlantAprendizajeMaquina.docx
+++ b/TAREAS 6 SEMESTRE/.Recursos/PlantAprendizajeMaquina.docx
@@ -13,10 +13,10 @@
           <w:noProof/>
         </w:rPr>
         <w:drawing>
-          <wp:anchor distT="0" distB="0" distL="114300" distR="114300" simplePos="0" relativeHeight="251644416" behindDoc="0" locked="0" layoutInCell="1" allowOverlap="1" wp14:anchorId="1EF86014" wp14:editId="13A3F885">
+          <wp:anchor distT="0" distB="0" distL="114300" distR="114300" simplePos="0" relativeHeight="251644416" behindDoc="0" locked="0" layoutInCell="1" allowOverlap="1" wp14:anchorId="1EF86014" wp14:editId="07A08718">
             <wp:simplePos x="0" y="0"/>
             <wp:positionH relativeFrom="margin">
-              <wp:posOffset>4678680</wp:posOffset>
+              <wp:posOffset>5072380</wp:posOffset>
             </wp:positionH>
             <wp:positionV relativeFrom="margin">
               <wp:posOffset>-292100</wp:posOffset>
@@ -73,10 +73,10 @@
           <w:noProof/>
         </w:rPr>
         <w:drawing>
-          <wp:anchor distT="0" distB="0" distL="114300" distR="114300" simplePos="0" relativeHeight="251655680" behindDoc="0" locked="0" layoutInCell="1" allowOverlap="1" wp14:anchorId="793EACE0" wp14:editId="2874DCC6">
+          <wp:anchor distT="0" distB="0" distL="114300" distR="114300" simplePos="0" relativeHeight="251655680" behindDoc="0" locked="0" layoutInCell="1" allowOverlap="1" wp14:anchorId="793EACE0" wp14:editId="6544488F">
             <wp:simplePos x="0" y="0"/>
             <wp:positionH relativeFrom="column">
-              <wp:posOffset>-982980</wp:posOffset>
+              <wp:posOffset>-589280</wp:posOffset>
             </wp:positionH>
             <wp:positionV relativeFrom="margin">
               <wp:posOffset>-152400</wp:posOffset>
@@ -128,23 +128,143 @@
           </wp:anchor>
         </w:drawing>
       </w:r>
-    </w:p>
-    <w:p>
-      <w:pPr>
-        <w:ind w:firstLine="708"/>
-      </w:pPr>
       <w:r>
         <w:rPr>
           <w:noProof/>
         </w:rPr>
         <w:drawing>
-          <wp:anchor distT="0" distB="0" distL="114300" distR="114300" simplePos="0" relativeHeight="251678208" behindDoc="0" locked="0" layoutInCell="1" allowOverlap="1" wp14:anchorId="67B17D77" wp14:editId="1D4F36EE">
+          <wp:anchor distT="0" distB="0" distL="114300" distR="114300" simplePos="0" relativeHeight="251671040" behindDoc="0" locked="0" layoutInCell="1" allowOverlap="1" wp14:anchorId="31D47963" wp14:editId="0A29162C">
             <wp:simplePos x="0" y="0"/>
             <wp:positionH relativeFrom="margin">
-              <wp:posOffset>5131854</wp:posOffset>
+              <wp:posOffset>149225</wp:posOffset>
             </wp:positionH>
             <wp:positionV relativeFrom="page">
-              <wp:posOffset>2503171</wp:posOffset>
+              <wp:posOffset>2498090</wp:posOffset>
+            </wp:positionV>
+            <wp:extent cx="347345" cy="347980"/>
+            <wp:effectExtent l="0" t="0" r="0" b="0"/>
+            <wp:wrapNone/>
+            <wp:docPr id="1854802566" name="Imagen 8" descr="Forma&#10;&#10;El contenido generado por IA puede ser incorrecto."/>
+            <wp:cNvGraphicFramePr>
+              <a:graphicFrameLocks xmlns:a="http://schemas.openxmlformats.org/drawingml/2006/main" noChangeAspect="1"/>
+            </wp:cNvGraphicFramePr>
+            <a:graphic xmlns:a="http://schemas.openxmlformats.org/drawingml/2006/main">
+              <a:graphicData uri="http://schemas.openxmlformats.org/drawingml/2006/picture">
+                <pic:pic xmlns:pic="http://schemas.openxmlformats.org/drawingml/2006/picture">
+                  <pic:nvPicPr>
+                    <pic:cNvPr id="1854802566" name="Imagen 8" descr="Forma&#10;&#10;El contenido generado por IA puede ser incorrecto."/>
+                    <pic:cNvPicPr/>
+                  </pic:nvPicPr>
+                  <pic:blipFill>
+                    <a:blip r:embed="rId10" cstate="print">
+                      <a:extLst>
+                        <a:ext uri="{28A0092B-C50C-407E-A947-70E740481C1C}">
+                          <a14:useLocalDpi xmlns:a14="http://schemas.microsoft.com/office/drawing/2010/main" val="0"/>
+                        </a:ext>
+                      </a:extLst>
+                    </a:blip>
+                    <a:stretch>
+                      <a:fillRect/>
+                    </a:stretch>
+                  </pic:blipFill>
+                  <pic:spPr>
+                    <a:xfrm>
+                      <a:off x="0" y="0"/>
+                      <a:ext cx="347345" cy="347980"/>
+                    </a:xfrm>
+                    <a:prstGeom prst="rect">
+                      <a:avLst/>
+                    </a:prstGeom>
+                  </pic:spPr>
+                </pic:pic>
+              </a:graphicData>
+            </a:graphic>
+            <wp14:sizeRelH relativeFrom="margin">
+              <wp14:pctWidth>0</wp14:pctWidth>
+            </wp14:sizeRelH>
+            <wp14:sizeRelV relativeFrom="margin">
+              <wp14:pctHeight>0</wp14:pctHeight>
+            </wp14:sizeRelV>
+          </wp:anchor>
+        </w:drawing>
+      </w:r>
+      <w:r>
+        <w:rPr>
+          <w:noProof/>
+        </w:rPr>
+        <w:drawing>
+          <wp:anchor distT="0" distB="0" distL="114300" distR="114300" simplePos="0" relativeHeight="251676160" behindDoc="0" locked="0" layoutInCell="1" allowOverlap="1" wp14:anchorId="57C056F0" wp14:editId="4AD28AF1">
+            <wp:simplePos x="0" y="0"/>
+            <wp:positionH relativeFrom="margin">
+              <wp:posOffset>130175</wp:posOffset>
+            </wp:positionH>
+            <wp:positionV relativeFrom="page">
+              <wp:posOffset>3735705</wp:posOffset>
+            </wp:positionV>
+            <wp:extent cx="347345" cy="347980"/>
+            <wp:effectExtent l="0" t="317" r="0" b="0"/>
+            <wp:wrapNone/>
+            <wp:docPr id="842310105" name="Imagen 8" descr="Forma&#10;&#10;El contenido generado por IA puede ser incorrecto."/>
+            <wp:cNvGraphicFramePr>
+              <a:graphicFrameLocks xmlns:a="http://schemas.openxmlformats.org/drawingml/2006/main" noChangeAspect="1"/>
+            </wp:cNvGraphicFramePr>
+            <a:graphic xmlns:a="http://schemas.openxmlformats.org/drawingml/2006/main">
+              <a:graphicData uri="http://schemas.openxmlformats.org/drawingml/2006/picture">
+                <pic:pic xmlns:pic="http://schemas.openxmlformats.org/drawingml/2006/picture">
+                  <pic:nvPicPr>
+                    <pic:cNvPr id="1854802566" name="Imagen 8" descr="Forma&#10;&#10;El contenido generado por IA puede ser incorrecto."/>
+                    <pic:cNvPicPr/>
+                  </pic:nvPicPr>
+                  <pic:blipFill>
+                    <a:blip r:embed="rId10" cstate="print">
+                      <a:extLst>
+                        <a:ext uri="{28A0092B-C50C-407E-A947-70E740481C1C}">
+                          <a14:useLocalDpi xmlns:a14="http://schemas.microsoft.com/office/drawing/2010/main" val="0"/>
+                        </a:ext>
+                      </a:extLst>
+                    </a:blip>
+                    <a:stretch>
+                      <a:fillRect/>
+                    </a:stretch>
+                  </pic:blipFill>
+                  <pic:spPr>
+                    <a:xfrm rot="16200000">
+                      <a:off x="0" y="0"/>
+                      <a:ext cx="347345" cy="347980"/>
+                    </a:xfrm>
+                    <a:prstGeom prst="rect">
+                      <a:avLst/>
+                    </a:prstGeom>
+                  </pic:spPr>
+                </pic:pic>
+              </a:graphicData>
+            </a:graphic>
+            <wp14:sizeRelH relativeFrom="margin">
+              <wp14:pctWidth>0</wp14:pctWidth>
+            </wp14:sizeRelH>
+            <wp14:sizeRelV relativeFrom="margin">
+              <wp14:pctHeight>0</wp14:pctHeight>
+            </wp14:sizeRelV>
+          </wp:anchor>
+        </w:drawing>
+      </w:r>
+    </w:p>
+    <w:p>
+      <w:pPr>
+        <w:ind w:firstLine="708"/>
+      </w:pPr>
+      <w:r>
+        <w:rPr>
+          <w:noProof/>
+        </w:rPr>
+        <w:drawing>
+          <wp:anchor distT="0" distB="0" distL="114300" distR="114300" simplePos="0" relativeHeight="251678208" behindDoc="0" locked="0" layoutInCell="1" allowOverlap="1" wp14:anchorId="67B17D77" wp14:editId="3F1A1A03">
+            <wp:simplePos x="0" y="0"/>
+            <wp:positionH relativeFrom="margin">
+              <wp:posOffset>5525452</wp:posOffset>
+            </wp:positionH>
+            <wp:positionV relativeFrom="page">
+              <wp:posOffset>2502853</wp:posOffset>
             </wp:positionV>
             <wp:extent cx="347345" cy="347980"/>
             <wp:effectExtent l="0" t="317" r="0" b="0"/>
@@ -193,66 +313,6 @@
           </wp:anchor>
         </w:drawing>
       </w:r>
-      <w:r>
-        <w:rPr>
-          <w:noProof/>
-        </w:rPr>
-        <w:drawing>
-          <wp:anchor distT="0" distB="0" distL="114300" distR="114300" simplePos="0" relativeHeight="251671040" behindDoc="0" locked="0" layoutInCell="1" allowOverlap="1" wp14:anchorId="31D47963" wp14:editId="4A6F0D27">
-            <wp:simplePos x="0" y="0"/>
-            <wp:positionH relativeFrom="margin">
-              <wp:posOffset>-244475</wp:posOffset>
-            </wp:positionH>
-            <wp:positionV relativeFrom="page">
-              <wp:posOffset>2498337</wp:posOffset>
-            </wp:positionV>
-            <wp:extent cx="347345" cy="347980"/>
-            <wp:effectExtent l="0" t="0" r="0" b="0"/>
-            <wp:wrapNone/>
-            <wp:docPr id="1854802566" name="Imagen 8" descr="Forma&#10;&#10;El contenido generado por IA puede ser incorrecto."/>
-            <wp:cNvGraphicFramePr>
-              <a:graphicFrameLocks xmlns:a="http://schemas.openxmlformats.org/drawingml/2006/main" noChangeAspect="1"/>
-            </wp:cNvGraphicFramePr>
-            <a:graphic xmlns:a="http://schemas.openxmlformats.org/drawingml/2006/main">
-              <a:graphicData uri="http://schemas.openxmlformats.org/drawingml/2006/picture">
-                <pic:pic xmlns:pic="http://schemas.openxmlformats.org/drawingml/2006/picture">
-                  <pic:nvPicPr>
-                    <pic:cNvPr id="1854802566" name="Imagen 8" descr="Forma&#10;&#10;El contenido generado por IA puede ser incorrecto."/>
-                    <pic:cNvPicPr/>
-                  </pic:nvPicPr>
-                  <pic:blipFill>
-                    <a:blip r:embed="rId10" cstate="print">
-                      <a:extLst>
-                        <a:ext uri="{28A0092B-C50C-407E-A947-70E740481C1C}">
-                          <a14:useLocalDpi xmlns:a14="http://schemas.microsoft.com/office/drawing/2010/main" val="0"/>
-                        </a:ext>
-                      </a:extLst>
-                    </a:blip>
-                    <a:stretch>
-                      <a:fillRect/>
-                    </a:stretch>
-                  </pic:blipFill>
-                  <pic:spPr>
-                    <a:xfrm>
-                      <a:off x="0" y="0"/>
-                      <a:ext cx="347345" cy="347980"/>
-                    </a:xfrm>
-                    <a:prstGeom prst="rect">
-                      <a:avLst/>
-                    </a:prstGeom>
-                  </pic:spPr>
-                </pic:pic>
-              </a:graphicData>
-            </a:graphic>
-            <wp14:sizeRelH relativeFrom="margin">
-              <wp14:pctWidth>0</wp14:pctWidth>
-            </wp14:sizeRelH>
-            <wp14:sizeRelV relativeFrom="margin">
-              <wp14:pctHeight>0</wp14:pctHeight>
-            </wp14:sizeRelV>
-          </wp:anchor>
-        </w:drawing>
-      </w:r>
     </w:p>
     <w:p>
       <w:r>
@@ -262,10 +322,10 @@
         <mc:AlternateContent>
           <mc:Choice Requires="wps">
             <w:drawing>
-              <wp:anchor distT="0" distB="0" distL="114300" distR="114300" simplePos="0" relativeHeight="251657728" behindDoc="0" locked="0" layoutInCell="1" allowOverlap="1" wp14:anchorId="12F471F9" wp14:editId="55015704">
+              <wp:anchor distT="0" distB="0" distL="114300" distR="114300" simplePos="0" relativeHeight="251657728" behindDoc="0" locked="0" layoutInCell="1" allowOverlap="1" wp14:anchorId="12F471F9" wp14:editId="0417C1E7">
                 <wp:simplePos x="0" y="0"/>
                 <wp:positionH relativeFrom="margin">
-                  <wp:posOffset>-15240</wp:posOffset>
+                  <wp:posOffset>378460</wp:posOffset>
                 </wp:positionH>
                 <wp:positionV relativeFrom="paragraph">
                   <wp:posOffset>290195</wp:posOffset>
@@ -338,7 +398,7 @@
                 <v:stroke joinstyle="miter"/>
                 <v:path gradientshapeok="t" o:connecttype="rect"/>
               </v:shapetype>
-              <v:shape id="Cuadro de texto 281" o:spid="_x0000_s1026" type="#_x0000_t202" style="position:absolute;left:0;text-align:left;margin-left:-1.2pt;margin-top:22.85pt;width:421.05pt;height:67.5pt;z-index:251657728;visibility:visible;mso-wrap-style:square;mso-width-percent:0;mso-height-percent:0;mso-wrap-distance-left:9pt;mso-wrap-distance-top:0;mso-wrap-distance-right:9pt;mso-wrap-distance-bottom:0;mso-position-horizontal:absolute;mso-position-horizontal-relative:margin;mso-position-vertical:absolute;mso-position-vertical-relative:text;mso-width-percent:0;mso-height-percent:0;mso-width-relative:margin;mso-height-relative:margin;v-text-anchor:top" o:gfxdata="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" filled="f" stroked="f" strokeweight="4.5pt">
+              <v:shape id="Cuadro de texto 281" o:spid="_x0000_s1026" type="#_x0000_t202" style="position:absolute;left:0;text-align:left;margin-left:29.8pt;margin-top:22.85pt;width:421.05pt;height:67.5pt;z-index:251657728;visibility:visible;mso-wrap-style:square;mso-width-percent:0;mso-height-percent:0;mso-wrap-distance-left:9pt;mso-wrap-distance-top:0;mso-wrap-distance-right:9pt;mso-wrap-distance-bottom:0;mso-position-horizontal:absolute;mso-position-horizontal-relative:margin;mso-position-vertical:absolute;mso-position-vertical-relative:text;mso-width-percent:0;mso-height-percent:0;mso-width-relative:margin;mso-height-relative:margin;v-text-anchor:top" o:gfxdata="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" filled="f" stroked="f" strokeweight="4.5pt">
                 <v:textbox>
                   <w:txbxContent>
                     <w:p>
@@ -377,13 +437,13 @@
           <w:noProof/>
         </w:rPr>
         <w:drawing>
-          <wp:anchor distT="0" distB="0" distL="114300" distR="114300" simplePos="0" relativeHeight="251679232" behindDoc="0" locked="0" layoutInCell="1" allowOverlap="1" wp14:anchorId="3E1D4ACF" wp14:editId="38575527">
+          <wp:anchor distT="0" distB="0" distL="114300" distR="114300" simplePos="0" relativeHeight="251679232" behindDoc="0" locked="0" layoutInCell="1" allowOverlap="1" wp14:anchorId="3E1D4ACF" wp14:editId="1EE9630A">
             <wp:simplePos x="0" y="0"/>
             <wp:positionH relativeFrom="margin">
-              <wp:posOffset>5141339</wp:posOffset>
+              <wp:posOffset>5534660</wp:posOffset>
             </wp:positionH>
             <wp:positionV relativeFrom="page">
-              <wp:posOffset>3743094</wp:posOffset>
+              <wp:posOffset>3742690</wp:posOffset>
             </wp:positionV>
             <wp:extent cx="347345" cy="347980"/>
             <wp:effectExtent l="0" t="0" r="0" b="0"/>
@@ -432,66 +492,6 @@
           </wp:anchor>
         </w:drawing>
       </w:r>
-      <w:r>
-        <w:rPr>
-          <w:noProof/>
-        </w:rPr>
-        <w:drawing>
-          <wp:anchor distT="0" distB="0" distL="114300" distR="114300" simplePos="0" relativeHeight="251676160" behindDoc="0" locked="0" layoutInCell="1" allowOverlap="1" wp14:anchorId="57C056F0" wp14:editId="77362481">
-            <wp:simplePos x="0" y="0"/>
-            <wp:positionH relativeFrom="margin">
-              <wp:posOffset>-257175</wp:posOffset>
-            </wp:positionH>
-            <wp:positionV relativeFrom="page">
-              <wp:posOffset>3752215</wp:posOffset>
-            </wp:positionV>
-            <wp:extent cx="347345" cy="347980"/>
-            <wp:effectExtent l="0" t="317" r="0" b="0"/>
-            <wp:wrapNone/>
-            <wp:docPr id="842310105" name="Imagen 8" descr="Forma&#10;&#10;El contenido generado por IA puede ser incorrecto."/>
-            <wp:cNvGraphicFramePr>
-              <a:graphicFrameLocks xmlns:a="http://schemas.openxmlformats.org/drawingml/2006/main" noChangeAspect="1"/>
-            </wp:cNvGraphicFramePr>
-            <a:graphic xmlns:a="http://schemas.openxmlformats.org/drawingml/2006/main">
-              <a:graphicData uri="http://schemas.openxmlformats.org/drawingml/2006/picture">
-                <pic:pic xmlns:pic="http://schemas.openxmlformats.org/drawingml/2006/picture">
-                  <pic:nvPicPr>
-                    <pic:cNvPr id="1854802566" name="Imagen 8" descr="Forma&#10;&#10;El contenido generado por IA puede ser incorrecto."/>
-                    <pic:cNvPicPr/>
-                  </pic:nvPicPr>
-                  <pic:blipFill>
-                    <a:blip r:embed="rId10" cstate="print">
-                      <a:extLst>
-                        <a:ext uri="{28A0092B-C50C-407E-A947-70E740481C1C}">
-                          <a14:useLocalDpi xmlns:a14="http://schemas.microsoft.com/office/drawing/2010/main" val="0"/>
-                        </a:ext>
-                      </a:extLst>
-                    </a:blip>
-                    <a:stretch>
-                      <a:fillRect/>
-                    </a:stretch>
-                  </pic:blipFill>
-                  <pic:spPr>
-                    <a:xfrm rot="16200000">
-                      <a:off x="0" y="0"/>
-                      <a:ext cx="347345" cy="347980"/>
-                    </a:xfrm>
-                    <a:prstGeom prst="rect">
-                      <a:avLst/>
-                    </a:prstGeom>
-                  </pic:spPr>
-                </pic:pic>
-              </a:graphicData>
-            </a:graphic>
-            <wp14:sizeRelH relativeFrom="margin">
-              <wp14:pctWidth>0</wp14:pctWidth>
-            </wp14:sizeRelH>
-            <wp14:sizeRelV relativeFrom="margin">
-              <wp14:pctHeight>0</wp14:pctHeight>
-            </wp14:sizeRelV>
-          </wp:anchor>
-        </w:drawing>
-      </w:r>
     </w:p>
     <w:p/>
     <w:p/>
@@ -501,7 +501,7 @@
           <w:noProof/>
         </w:rPr>
         <w:drawing>
-          <wp:anchor distT="0" distB="0" distL="114300" distR="114300" simplePos="0" relativeHeight="251680256" behindDoc="0" locked="0" layoutInCell="1" allowOverlap="1" wp14:anchorId="0D38CECC" wp14:editId="0C7F8802">
+          <wp:anchor distT="0" distB="0" distL="114300" distR="114300" simplePos="0" relativeHeight="251680256" behindDoc="0" locked="0" layoutInCell="1" allowOverlap="1" wp14:anchorId="0D38CECC" wp14:editId="2B08C614">
             <wp:simplePos x="0" y="0"/>
             <wp:positionH relativeFrom="page">
               <wp:posOffset>3011170</wp:posOffset>
@@ -579,7 +579,7 @@
         <mc:AlternateContent>
           <mc:Choice Requires="wps">
             <w:drawing>
-              <wp:anchor distT="0" distB="0" distL="114300" distR="114300" simplePos="0" relativeHeight="251659776" behindDoc="0" locked="0" layoutInCell="1" allowOverlap="1" wp14:anchorId="5D1D070E" wp14:editId="2446A525">
+              <wp:anchor distT="0" distB="0" distL="114300" distR="114300" simplePos="0" relativeHeight="251659776" behindDoc="0" locked="0" layoutInCell="1" allowOverlap="1" wp14:anchorId="5D1D070E" wp14:editId="0AA3BD84">
                 <wp:simplePos x="0" y="0"/>
                 <wp:positionH relativeFrom="page">
                   <wp:posOffset>2086715</wp:posOffset>
@@ -653,11 +653,7 @@
           </mc:Choice>
           <mc:Fallback>
             <w:pict>
-              <v:shapetype w14:anchorId="5D1D070E" id="_x0000_t202" coordsize="21600,21600" o:spt="202" path="m,l,21600r21600,l21600,xe">
-                <v:stroke joinstyle="miter"/>
-                <v:path gradientshapeok="t" o:connecttype="rect"/>
-              </v:shapetype>
-              <v:shape id="Cuadro de texto 282" o:spid="_x0000_s1027" type="#_x0000_t202" style="position:absolute;left:0;text-align:left;margin-left:164.3pt;margin-top:1.3pt;width:258.15pt;height:31.8pt;z-index:251659776;visibility:visible;mso-wrap-style:square;mso-width-percent:0;mso-height-percent:0;mso-wrap-distance-left:9pt;mso-wrap-distance-top:0;mso-wrap-distance-right:9pt;mso-wrap-distance-bottom:0;mso-position-horizontal:absolute;mso-position-horizontal-relative:page;mso-position-vertical:absolute;mso-position-vertical-relative:text;mso-width-percent:0;mso-height-percent:0;mso-width-relative:margin;mso-height-relative:margin;v-text-anchor:top" o:gfxdata="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" filled="f" stroked="f" strokeweight=".5pt">
+              <v:shape w14:anchorId="5D1D070E" id="Cuadro de texto 282" o:spid="_x0000_s1027" type="#_x0000_t202" style="position:absolute;left:0;text-align:left;margin-left:164.3pt;margin-top:1.3pt;width:258.15pt;height:31.8pt;z-index:251659776;visibility:visible;mso-wrap-style:square;mso-width-percent:0;mso-height-percent:0;mso-wrap-distance-left:9pt;mso-wrap-distance-top:0;mso-wrap-distance-right:9pt;mso-wrap-distance-bottom:0;mso-position-horizontal:absolute;mso-position-horizontal-relative:page;mso-position-vertical:absolute;mso-position-vertical-relative:text;mso-width-percent:0;mso-height-percent:0;mso-width-relative:margin;mso-height-relative:margin;v-text-anchor:top" o:gfxdata="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" filled="f" stroked="f" strokeweight=".5pt">
                 <v:textbox>
                   <w:txbxContent>
                     <w:p>
@@ -699,7 +695,7 @@
         <mc:AlternateContent>
           <mc:Choice Requires="wps">
             <w:drawing>
-              <wp:anchor distT="0" distB="0" distL="114300" distR="114300" simplePos="0" relativeHeight="251662848" behindDoc="0" locked="0" layoutInCell="1" allowOverlap="1" wp14:anchorId="4291E76D" wp14:editId="31F60BEF">
+              <wp:anchor distT="0" distB="0" distL="114300" distR="114300" simplePos="0" relativeHeight="251662848" behindDoc="0" locked="0" layoutInCell="1" allowOverlap="1" wp14:anchorId="4291E76D" wp14:editId="46AA3909">
                 <wp:simplePos x="0" y="0"/>
                 <wp:positionH relativeFrom="page">
                   <wp:posOffset>2643610</wp:posOffset>
@@ -813,7 +809,7 @@
         <mc:AlternateContent>
           <mc:Choice Requires="wps">
             <w:drawing>
-              <wp:anchor distT="0" distB="0" distL="114300" distR="114300" simplePos="0" relativeHeight="251683328" behindDoc="0" locked="0" layoutInCell="1" allowOverlap="1" wp14:anchorId="26741B22" wp14:editId="49221E2B">
+              <wp:anchor distT="0" distB="0" distL="114300" distR="114300" simplePos="0" relativeHeight="251683328" behindDoc="0" locked="0" layoutInCell="1" allowOverlap="1" wp14:anchorId="26741B22" wp14:editId="0B5ADE12">
                 <wp:simplePos x="0" y="0"/>
                 <wp:positionH relativeFrom="page">
                   <wp:posOffset>3581351</wp:posOffset>
@@ -868,7 +864,7 @@
           </mc:Choice>
           <mc:Fallback>
             <w:pict>
-              <v:line w14:anchorId="298B0CD5" id="Conector recto 13" o:spid="_x0000_s1026" style="position:absolute;z-index:251683328;visibility:visible;mso-wrap-style:square;mso-width-percent:0;mso-height-percent:0;mso-wrap-distance-left:9pt;mso-wrap-distance-top:0;mso-wrap-distance-right:9pt;mso-wrap-distance-bottom:0;mso-position-horizontal:absolute;mso-position-horizontal-relative:page;mso-position-vertical:absolute;mso-position-vertical-relative:text;mso-width-percent:0;mso-height-percent:0;mso-width-relative:margin;mso-height-relative:margin" from="282pt,9.5pt" to="301.5pt,9.5pt" o:gfxdata="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" strokecolor="black [3200]" strokeweight="1pt">
+              <v:line w14:anchorId="51AB7B5B" id="Conector recto 13" o:spid="_x0000_s1026" style="position:absolute;z-index:251683328;visibility:visible;mso-wrap-style:square;mso-width-percent:0;mso-height-percent:0;mso-wrap-distance-left:9pt;mso-wrap-distance-top:0;mso-wrap-distance-right:9pt;mso-wrap-distance-bottom:0;mso-position-horizontal:absolute;mso-position-horizontal-relative:page;mso-position-vertical:absolute;mso-position-vertical-relative:text;mso-width-percent:0;mso-height-percent:0;mso-width-relative:margin;mso-height-relative:margin" from="282pt,9.5pt" to="301.5pt,9.5pt" o:gfxdata="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" strokecolor="black [3200]" strokeweight="1pt">
                 <v:stroke joinstyle="miter"/>
                 <w10:wrap anchorx="page"/>
               </v:line>
@@ -883,7 +879,7 @@
         <mc:AlternateContent>
           <mc:Choice Requires="wps">
             <w:drawing>
-              <wp:anchor distT="0" distB="0" distL="114300" distR="114300" simplePos="0" relativeHeight="251681280" behindDoc="0" locked="0" layoutInCell="1" allowOverlap="1" wp14:anchorId="05CD11DF" wp14:editId="209854CE">
+              <wp:anchor distT="0" distB="0" distL="114300" distR="114300" simplePos="0" relativeHeight="251681280" behindDoc="0" locked="0" layoutInCell="1" allowOverlap="1" wp14:anchorId="05CD11DF" wp14:editId="38061D2D">
                 <wp:simplePos x="0" y="0"/>
                 <wp:positionH relativeFrom="page">
                   <wp:posOffset>3343446</wp:posOffset>
@@ -947,7 +943,7 @@
           </mc:Choice>
           <mc:Fallback>
             <w:pict>
-              <v:line w14:anchorId="744DABE4" id="Conector recto 13" o:spid="_x0000_s1026" style="position:absolute;z-index:251681280;visibility:visible;mso-wrap-style:square;mso-width-percent:0;mso-height-percent:0;mso-wrap-distance-left:9pt;mso-wrap-distance-top:0;mso-wrap-distance-right:9pt;mso-wrap-distance-bottom:0;mso-position-horizontal:absolute;mso-position-horizontal-relative:page;mso-position-vertical:absolute;mso-position-vertical-relative:text;mso-width-percent:0;mso-height-percent:0;mso-width-relative:margin;mso-height-relative:margin" from="263.25pt,3.55pt" to="319.8pt,3.55pt" o:gfxdata="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" strokecolor="black [3200]" strokeweight="1.5pt">
+              <v:line w14:anchorId="3FDF3B40" id="Conector recto 13" o:spid="_x0000_s1026" style="position:absolute;z-index:251681280;visibility:visible;mso-wrap-style:square;mso-width-percent:0;mso-height-percent:0;mso-wrap-distance-left:9pt;mso-wrap-distance-top:0;mso-wrap-distance-right:9pt;mso-wrap-distance-bottom:0;mso-position-horizontal:absolute;mso-position-horizontal-relative:page;mso-position-vertical:absolute;mso-position-vertical-relative:text;mso-width-percent:0;mso-height-percent:0;mso-width-relative:margin;mso-height-relative:margin" from="263.25pt,3.55pt" to="319.8pt,3.55pt" o:gfxdata="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" strokecolor="black [3200]" strokeweight="1.5pt">
                 <v:stroke dashstyle="dash"/>
                 <w10:wrap anchorx="page"/>
               </v:line>
@@ -977,24 +973,26 @@
       </w:pPr>
       <w:r>
         <w:rPr>
-          <w:rFonts w:asciiTheme="majorHAnsi" w:hAnsiTheme="majorHAnsi" w:cstheme="majorHAnsi"/>
+          <w:rFonts w:ascii="Times New Roman" w:eastAsia="Times New Roman" w:hAnsi="Times New Roman" w:cs="Times New Roman"/>
           <w:noProof/>
-          <w:sz w:val="40"/>
-          <w:szCs w:val="44"/>
+          <w:color w:val="auto"/>
+          <w:kern w:val="0"/>
+          <w:lang w:val="en-US" w:eastAsia="en-US"/>
+          <w14:ligatures w14:val="none"/>
         </w:rPr>
         <w:drawing>
-          <wp:anchor distT="0" distB="0" distL="114300" distR="114300" simplePos="0" relativeHeight="251684352" behindDoc="0" locked="0" layoutInCell="1" allowOverlap="1" wp14:anchorId="67AECEDE" wp14:editId="0745D142">
+          <wp:anchor distT="0" distB="0" distL="114300" distR="114300" simplePos="0" relativeHeight="251686400" behindDoc="0" locked="0" layoutInCell="1" allowOverlap="1" wp14:anchorId="238AAFCC" wp14:editId="154644B4">
             <wp:simplePos x="0" y="0"/>
-            <wp:positionH relativeFrom="column">
-              <wp:posOffset>3844468</wp:posOffset>
+            <wp:positionH relativeFrom="margin">
+              <wp:posOffset>3968750</wp:posOffset>
             </wp:positionH>
             <wp:positionV relativeFrom="margin">
-              <wp:posOffset>5829640</wp:posOffset>
+              <wp:posOffset>5750703</wp:posOffset>
             </wp:positionV>
-            <wp:extent cx="2066444" cy="2415600"/>
-            <wp:effectExtent l="76200" t="76200" r="124460" b="137160"/>
+            <wp:extent cx="1973586" cy="2415600"/>
+            <wp:effectExtent l="171450" t="152400" r="369570" b="365760"/>
             <wp:wrapSquare wrapText="bothSides"/>
-            <wp:docPr id="1549455107" name="Imagen 9"/>
+            <wp:docPr id="1564397618" name="Picture 9"/>
             <wp:cNvGraphicFramePr>
               <a:graphicFrameLocks xmlns:a="http://schemas.openxmlformats.org/drawingml/2006/main" noChangeAspect="1"/>
             </wp:cNvGraphicFramePr>
@@ -1002,12 +1000,12 @@
               <a:graphicData uri="http://schemas.openxmlformats.org/drawingml/2006/picture">
                 <pic:pic xmlns:pic="http://schemas.openxmlformats.org/drawingml/2006/picture">
                   <pic:nvPicPr>
-                    <pic:cNvPr id="0" name="Picture 2"/>
+                    <pic:cNvPr id="0" name="Picture 5"/>
                     <pic:cNvPicPr>
                       <a:picLocks noChangeAspect="1" noChangeArrowheads="1"/>
                     </pic:cNvPicPr>
                   </pic:nvPicPr>
-                  <pic:blipFill>
+                  <pic:blipFill rotWithShape="1">
                     <a:blip r:embed="rId12" cstate="print">
                       <a:extLst>
                         <a:ext uri="{28A0092B-C50C-407E-A947-70E740481C1C}">
@@ -1015,7 +1013,7 @@
                         </a:ext>
                       </a:extLst>
                     </a:blip>
-                    <a:srcRect/>
+                    <a:srcRect l="2665" r="5134" b="5354"/>
                     <a:stretch>
                       <a:fillRect/>
                     </a:stretch>
@@ -1023,25 +1021,26 @@
                   <pic:spPr bwMode="auto">
                     <a:xfrm>
                       <a:off x="0" y="0"/>
-                      <a:ext cx="2066444" cy="2415600"/>
+                      <a:ext cx="1973586" cy="2415600"/>
                     </a:xfrm>
                     <a:prstGeom prst="rect">
                       <a:avLst/>
                     </a:prstGeom>
-                    <a:ln w="38100" cap="sq">
-                      <a:solidFill>
-                        <a:srgbClr val="000000"/>
-                      </a:solidFill>
-                      <a:prstDash val="solid"/>
-                      <a:miter lim="800000"/>
+                    <a:ln>
+                      <a:noFill/>
                     </a:ln>
                     <a:effectLst>
-                      <a:outerShdw blurRad="50800" dist="38100" dir="2700000" algn="tl" rotWithShape="0">
-                        <a:srgbClr val="000000">
-                          <a:alpha val="43000"/>
+                      <a:outerShdw blurRad="292100" dist="139700" dir="2700000" algn="tl" rotWithShape="0">
+                        <a:srgbClr val="333333">
+                          <a:alpha val="65000"/>
                         </a:srgbClr>
                       </a:outerShdw>
                     </a:effectLst>
+                    <a:extLst>
+                      <a:ext uri="{53640926-AAD7-44D8-BBD7-CCE9431645EC}">
+                        <a14:shadowObscured xmlns:a14="http://schemas.microsoft.com/office/drawing/2010/main"/>
+                      </a:ext>
+                    </a:extLst>
                   </pic:spPr>
                 </pic:pic>
               </a:graphicData>
@@ -1065,16 +1064,16 @@
         <mc:AlternateContent>
           <mc:Choice Requires="wps">
             <w:drawing>
-              <wp:anchor distT="0" distB="0" distL="114300" distR="114300" simplePos="0" relativeHeight="251655168" behindDoc="0" locked="0" layoutInCell="1" allowOverlap="1" wp14:anchorId="4382B185" wp14:editId="2DDE94BD">
+              <wp:anchor distT="0" distB="0" distL="114300" distR="114300" simplePos="0" relativeHeight="251655168" behindDoc="0" locked="0" layoutInCell="1" allowOverlap="1" wp14:anchorId="4382B185" wp14:editId="3D00B3C2">
                 <wp:simplePos x="0" y="0"/>
                 <wp:positionH relativeFrom="page">
-                  <wp:posOffset>890920</wp:posOffset>
+                  <wp:posOffset>889205</wp:posOffset>
                 </wp:positionH>
                 <wp:positionV relativeFrom="paragraph">
-                  <wp:posOffset>142137</wp:posOffset>
+                  <wp:posOffset>146583</wp:posOffset>
                 </wp:positionV>
-                <wp:extent cx="3840568" cy="2415805"/>
-                <wp:effectExtent l="19050" t="19050" r="26670" b="22860"/>
+                <wp:extent cx="3623801" cy="2415540"/>
+                <wp:effectExtent l="19050" t="19050" r="15240" b="22860"/>
                 <wp:wrapNone/>
                 <wp:docPr id="589855732" name="Cuadro de texto 283"/>
                 <wp:cNvGraphicFramePr/>
@@ -1085,7 +1084,7 @@
                       <wps:spPr>
                         <a:xfrm>
                           <a:off x="0" y="0"/>
-                          <a:ext cx="3840568" cy="2415805"/>
+                          <a:ext cx="3623801" cy="2415540"/>
                         </a:xfrm>
                         <a:prstGeom prst="rect">
                           <a:avLst/>
@@ -1319,7 +1318,7 @@
           </mc:Choice>
           <mc:Fallback>
             <w:pict>
-              <v:shape w14:anchorId="4382B185" id="Cuadro de texto 283" o:spid="_x0000_s1029" type="#_x0000_t202" style="position:absolute;left:0;text-align:left;margin-left:70.15pt;margin-top:11.2pt;width:302.4pt;height:190.2pt;z-index:251655168;visibility:visible;mso-wrap-style:square;mso-width-percent:0;mso-height-percent:0;mso-wrap-distance-left:9pt;mso-wrap-distance-top:0;mso-wrap-distance-right:9pt;mso-wrap-distance-bottom:0;mso-position-horizontal:absolute;mso-position-horizontal-relative:page;mso-position-vertical:absolute;mso-position-vertical-relative:text;mso-width-percent:0;mso-height-percent:0;mso-width-relative:margin;mso-height-relative:margin;v-text-anchor:top" o:gfxdata="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" filled="f" strokecolor="#81685d [1614]" strokeweight="3pt">
+              <v:shape w14:anchorId="4382B185" id="Cuadro de texto 283" o:spid="_x0000_s1029" type="#_x0000_t202" style="position:absolute;left:0;text-align:left;margin-left:70pt;margin-top:11.55pt;width:285.35pt;height:190.2pt;z-index:251655168;visibility:visible;mso-wrap-style:square;mso-width-percent:0;mso-height-percent:0;mso-wrap-distance-left:9pt;mso-wrap-distance-top:0;mso-wrap-distance-right:9pt;mso-wrap-distance-bottom:0;mso-position-horizontal:absolute;mso-position-horizontal-relative:page;mso-position-vertical:absolute;mso-position-vertical-relative:text;mso-width-percent:0;mso-height-percent:0;mso-width-relative:margin;mso-height-relative:margin;v-text-anchor:top" o:gfxdata="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" filled="f" strokecolor="#81685d [1614]" strokeweight="3pt">
                 <v:stroke dashstyle="longDashDotDot"/>
                 <v:textbox>
                   <w:txbxContent>
@@ -1528,6 +1527,77 @@
       </w:r>
       <w:r>
         <w:rPr>
+          <w:noProof/>
+        </w:rPr>
+        <mc:AlternateContent>
+          <mc:Choice Requires="wps">
+            <w:drawing>
+              <wp:inline distT="0" distB="0" distL="0" distR="0" wp14:anchorId="4420BB3F" wp14:editId="61A7A490">
+                <wp:extent cx="300990" cy="300990"/>
+                <wp:effectExtent l="0" t="0" r="0" b="0"/>
+                <wp:docPr id="1433427658" name="Rectangle 7"/>
+                <wp:cNvGraphicFramePr>
+                  <a:graphicFrameLocks xmlns:a="http://schemas.openxmlformats.org/drawingml/2006/main" noChangeAspect="1"/>
+                </wp:cNvGraphicFramePr>
+                <a:graphic xmlns:a="http://schemas.openxmlformats.org/drawingml/2006/main">
+                  <a:graphicData uri="http://schemas.microsoft.com/office/word/2010/wordprocessingShape">
+                    <wps:wsp>
+                      <wps:cNvSpPr>
+                        <a:spLocks noChangeAspect="1" noChangeArrowheads="1"/>
+                      </wps:cNvSpPr>
+                      <wps:spPr bwMode="auto">
+                        <a:xfrm>
+                          <a:off x="0" y="0"/>
+                          <a:ext cx="300990" cy="300990"/>
+                        </a:xfrm>
+                        <a:prstGeom prst="rect">
+                          <a:avLst/>
+                        </a:prstGeom>
+                        <a:noFill/>
+                        <a:ln>
+                          <a:noFill/>
+                        </a:ln>
+                        <a:extLst>
+                          <a:ext uri="{909E8E84-426E-40DD-AFC4-6F175D3DCCD1}">
+                            <a14:hiddenFill xmlns:a14="http://schemas.microsoft.com/office/drawing/2010/main">
+                              <a:solidFill>
+                                <a:srgbClr val="FFFFFF"/>
+                              </a:solidFill>
+                            </a14:hiddenFill>
+                          </a:ext>
+                          <a:ext uri="{91240B29-F687-4F45-9708-019B960494DF}">
+                            <a14:hiddenLine xmlns:a14="http://schemas.microsoft.com/office/drawing/2010/main" w="9525">
+                              <a:solidFill>
+                                <a:srgbClr val="000000"/>
+                              </a:solidFill>
+                              <a:miter lim="800000"/>
+                              <a:headEnd/>
+                              <a:tailEnd/>
+                            </a14:hiddenLine>
+                          </a:ext>
+                        </a:extLst>
+                      </wps:spPr>
+                      <wps:bodyPr rot="0" vert="horz" wrap="square" lIns="91440" tIns="45720" rIns="91440" bIns="45720" anchor="t" anchorCtr="0" upright="1">
+                        <a:noAutofit/>
+                      </wps:bodyPr>
+                    </wps:wsp>
+                  </a:graphicData>
+                </a:graphic>
+              </wp:inline>
+            </w:drawing>
+          </mc:Choice>
+          <mc:Fallback>
+            <w:pict>
+              <v:rect w14:anchorId="311D2685" id="Rectangle 7" o:spid="_x0000_s1026" style="width:23.7pt;height:23.7pt;visibility:visible;mso-wrap-style:square;mso-left-percent:-10001;mso-top-percent:-10001;mso-position-horizontal:absolute;mso-position-horizontal-relative:char;mso-position-vertical:absolute;mso-position-vertical-relative:line;mso-left-percent:-10001;mso-top-percent:-10001;v-text-anchor:top" o:gfxdata="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" filled="f" stroked="f">
+                <o:lock v:ext="edit" aspectratio="t"/>
+                <w10:anchorlock/>
+              </v:rect>
+            </w:pict>
+          </mc:Fallback>
+        </mc:AlternateContent>
+      </w:r>
+      <w:r>
+        <w:rPr>
           <w:rFonts w:asciiTheme="majorHAnsi" w:hAnsiTheme="majorHAnsi" w:cstheme="majorHAnsi"/>
           <w:sz w:val="40"/>
           <w:szCs w:val="44"/>
@@ -1560,21 +1630,21 @@
       <w:sdtContent>
         <w:p>
           <w:pPr>
-            <w:pStyle w:val="Ttulo1"/>
+            <w:pStyle w:val="Heading1"/>
             <w:rPr>
-              <w:rStyle w:val="Ttulo1Car"/>
+              <w:rStyle w:val="Heading1Char"/>
             </w:rPr>
           </w:pPr>
           <w:r>
             <w:rPr>
-              <w:rStyle w:val="Ttulo1Car"/>
+              <w:rStyle w:val="Heading1Char"/>
               <w:lang w:val="es-ES"/>
             </w:rPr>
             <w:t>Í</w:t>
           </w:r>
           <w:r>
             <w:rPr>
-              <w:rStyle w:val="Ttulo1Car"/>
+              <w:rStyle w:val="Heading1Char"/>
               <w:lang w:val="es-ES"/>
             </w:rPr>
             <w:t>ndice</w:t>
@@ -1583,7 +1653,7 @@
         </w:p>
         <w:p>
           <w:pPr>
-            <w:pStyle w:val="TDC1"/>
+            <w:pStyle w:val="TOC1"/>
             <w:tabs>
               <w:tab w:val="right" w:leader="dot" w:pos="9111"/>
             </w:tabs>
@@ -1605,7 +1675,7 @@
           <w:hyperlink w:anchor="_Toc220850609" w:history="1">
             <w:r>
               <w:rPr>
-                <w:rStyle w:val="Hipervnculo"/>
+                <w:rStyle w:val="Hyperlink"/>
                 <w:noProof/>
                 <w:lang w:val="es-ES"/>
               </w:rPr>
@@ -1663,7 +1733,7 @@
         </w:p>
         <w:p>
           <w:pPr>
-            <w:pStyle w:val="TDC1"/>
+            <w:pStyle w:val="TOC1"/>
             <w:tabs>
               <w:tab w:val="right" w:leader="dot" w:pos="9111"/>
             </w:tabs>
@@ -1676,7 +1746,7 @@
           <w:hyperlink w:anchor="_Toc220850610" w:history="1">
             <w:r>
               <w:rPr>
-                <w:rStyle w:val="Hipervnculo"/>
+                <w:rStyle w:val="Hyperlink"/>
                 <w:noProof/>
               </w:rPr>
               <w:t>Tabla de ilustraciones</w:t>
@@ -1733,7 +1803,7 @@
         </w:p>
         <w:p>
           <w:pPr>
-            <w:pStyle w:val="TDC1"/>
+            <w:pStyle w:val="TOC1"/>
             <w:tabs>
               <w:tab w:val="right" w:leader="dot" w:pos="9111"/>
             </w:tabs>
@@ -1746,7 +1816,7 @@
           <w:hyperlink w:anchor="_Toc220850611" w:history="1">
             <w:r>
               <w:rPr>
-                <w:rStyle w:val="Hipervnculo"/>
+                <w:rStyle w:val="Hyperlink"/>
                 <w:noProof/>
               </w:rPr>
               <w:t>Desarrollo</w:t>
@@ -1803,7 +1873,7 @@
         </w:p>
         <w:p>
           <w:pPr>
-            <w:pStyle w:val="TDC1"/>
+            <w:pStyle w:val="TOC1"/>
             <w:tabs>
               <w:tab w:val="right" w:leader="dot" w:pos="9111"/>
             </w:tabs>
@@ -1816,7 +1886,7 @@
           <w:hyperlink w:anchor="_Toc220850612" w:history="1">
             <w:r>
               <w:rPr>
-                <w:rStyle w:val="Hipervnculo"/>
+                <w:rStyle w:val="Hyperlink"/>
                 <w:noProof/>
               </w:rPr>
               <w:t>Conclusión</w:t>
@@ -1873,7 +1943,7 @@
         </w:p>
         <w:p>
           <w:pPr>
-            <w:pStyle w:val="TDC1"/>
+            <w:pStyle w:val="TOC1"/>
             <w:tabs>
               <w:tab w:val="right" w:leader="dot" w:pos="9111"/>
             </w:tabs>
@@ -1886,7 +1956,7 @@
           <w:hyperlink w:anchor="_Toc220850613" w:history="1">
             <w:r>
               <w:rPr>
-                <w:rStyle w:val="Hipervnculo"/>
+                <w:rStyle w:val="Hyperlink"/>
                 <w:noProof/>
               </w:rPr>
               <w:t>Bibliografía</w:t>
@@ -1955,7 +2025,7 @@
     </w:sdt>
     <w:p>
       <w:pPr>
-        <w:pStyle w:val="Ttulo1"/>
+        <w:pStyle w:val="Heading1"/>
       </w:pPr>
       <w:bookmarkStart w:id="1" w:name="_Toc220850610"/>
       <w:r>
@@ -1979,7 +2049,7 @@
     <w:p/>
     <w:p>
       <w:pPr>
-        <w:pStyle w:val="Ttulo1"/>
+        <w:pStyle w:val="Heading1"/>
       </w:pPr>
       <w:bookmarkStart w:id="2" w:name="_Toc220850611"/>
       <w:r>
@@ -2010,7 +2080,7 @@
     </w:p>
     <w:p>
       <w:pPr>
-        <w:pStyle w:val="Ttulo1"/>
+        <w:pStyle w:val="Heading1"/>
       </w:pPr>
       <w:bookmarkStart w:id="3" w:name="_Toc220850612"/>
       <w:r>
@@ -2028,7 +2098,7 @@
     </w:p>
     <w:p>
       <w:pPr>
-        <w:pStyle w:val="Ttulo1"/>
+        <w:pStyle w:val="Heading1"/>
       </w:pPr>
       <w:bookmarkStart w:id="4" w:name="_Toc220850613"/>
       <w:r>
@@ -2048,6 +2118,19 @@
     <w:p/>
     <w:p/>
     <w:p/>
+    <w:p>
+      <w:pPr>
+        <w:spacing w:before="100" w:beforeAutospacing="1" w:after="100" w:afterAutospacing="1" w:line="240" w:lineRule="auto"/>
+        <w:jc w:val="left"/>
+        <w:rPr>
+          <w:rFonts w:ascii="Times New Roman" w:eastAsia="Times New Roman" w:hAnsi="Times New Roman" w:cs="Times New Roman"/>
+          <w:color w:val="auto"/>
+          <w:kern w:val="0"/>
+          <w:lang w:val="en-US" w:eastAsia="en-US"/>
+          <w14:ligatures w14:val="none"/>
+        </w:rPr>
+      </w:pPr>
+    </w:p>
     <w:p/>
     <w:p/>
     <w:p/>
@@ -2057,7 +2140,7 @@
       <w:footerReference w:type="even" r:id="rId15"/>
       <w:footerReference w:type="default" r:id="rId16"/>
       <w:pgSz w:w="12240" w:h="15840"/>
-      <w:pgMar w:top="1418" w:right="1134" w:bottom="1418" w:left="1701" w:header="720" w:footer="720" w:gutter="284"/>
+      <w:pgMar w:top="1440" w:right="1080" w:bottom="1440" w:left="1080" w:header="720" w:footer="720" w:gutter="284"/>
       <w:pgBorders w:offsetFrom="page">
         <w:top w:val="threeDEngrave" w:sz="36" w:space="0" w:color="846700" w:themeColor="accent1" w:themeShade="80"/>
         <w:left w:val="threeDEngrave" w:sz="36" w:space="0" w:color="846700" w:themeColor="accent1" w:themeShade="80"/>
@@ -2067,7 +2150,7 @@
       <w:pgNumType w:start="0"/>
       <w:cols w:space="720"/>
       <w:titlePg/>
-      <w:docGrid w:linePitch="299"/>
+      <w:docGrid w:linePitch="326"/>
     </w:sectPr>
   </w:body>
 </w:document>
@@ -2118,7 +2201,7 @@
     <w:sdtContent>
       <w:p>
         <w:pPr>
-          <w:pStyle w:val="Piedepgina"/>
+          <w:pStyle w:val="Footer"/>
           <w:jc w:val="center"/>
           <w:rPr>
             <w:rFonts w:asciiTheme="majorHAnsi" w:hAnsiTheme="majorHAnsi" w:cstheme="majorHAnsi"/>
@@ -2184,7 +2267,7 @@
   </w:sdt>
   <w:p>
     <w:pPr>
-      <w:pStyle w:val="Piedepgina"/>
+      <w:pStyle w:val="Footer"/>
     </w:pPr>
   </w:p>
 </w:ftr>
@@ -2194,7 +2277,7 @@
 <w:ftr xmlns:wpc="http://schemas.microsoft.com/office/word/2010/wordprocessingCanvas" xmlns:cx="http://schemas.microsoft.com/office/drawing/2014/chartex" xmlns:cx1="http://schemas.microsoft.com/office/drawing/2015/9/8/chartex" xmlns:cx2="http://schemas.microsoft.com/office/drawing/2015/10/21/chartex" xmlns:cx3="http://schemas.microsoft.com/office/drawing/2016/5/9/chartex" xmlns:cx4="http://schemas.microsoft.com/office/drawing/2016/5/10/chartex" xmlns:cx5="http://schemas.microsoft.com/office/drawing/2016/5/11/chartex" xmlns:cx6="http://schemas.microsoft.com/office/drawing/2016/5/12/chartex" xmlns:cx7="http://schemas.microsoft.com/office/drawing/2016/5/13/chartex" xmlns:cx8="http://schemas.microsoft.com/office/drawing/2016/5/14/chartex" xmlns:mc="http://schemas.openxmlformats.org/markup-compatibility/2006" xmlns:aink="http://schemas.microsoft.com/office/drawing/2016/ink" xmlns:am3d="http://schemas.microsoft.com/office/drawing/2017/model3d" xmlns:o="urn:schemas-microsoft-com:office:office" xmlns:oel="http://schemas.microsoft.com/office/2019/extlst" xmlns:r="http://schemas.openxmlformats.org/officeDocument/2006/relationships" xmlns:m="http://schemas.openxmlformats.org/officeDocument/2006/math" xmlns:v="urn:schemas-microsoft-com:vml" xmlns:wp14="http://schemas.microsoft.com/office/word/2010/wordprocessingDrawing" xmlns:wp="http://schemas.openxmlformats.org/drawingml/2006/wordprocessingDrawing" xmlns:w10="urn:schemas-microsoft-com:office:word" xmlns:w="http://schemas.openxmlformats.org/wordprocessingml/2006/main" xmlns:w14="http://schemas.microsoft.com/office/word/2010/wordml" xmlns:w15="http://schemas.microsoft.com/office/word/2012/wordml" xmlns:w16cex="http://schemas.microsoft.com/office/word/2018/wordml/cex" xmlns:w16cid="http://schemas.microsoft.com/office/word/2016/wordml/cid" xmlns:w16="http://schemas.microsoft.com/office/word/2018/wordml" xmlns:w16du="http://schemas.microsoft.com/office/word/2023/wordml/word16du" xmlns:w16sdtdh="http://schemas.microsoft.com/office/word/2020/wordml/sdtdatahash" xmlns:w16sdtfl="http://schemas.microsoft.com/office/word/2024/wordml/sdtformatlock" xmlns:w16se="http://schemas.microsoft.com/office/word/2015/wordml/symex" xmlns:wpg="http://schemas.microsoft.com/office/word/2010/wordprocessingGroup" xmlns:wpi="http://schemas.microsoft.com/office/word/2010/wordprocessingInk" xmlns:wne="http://schemas.microsoft.com/office/word/2006/wordml" xmlns:wps="http://schemas.microsoft.com/office/word/2010/wordprocessingShape" mc:Ignorable="w14 w15 w16se w16cid w16 w16cex w16sdtdh w16sdtfl w16du wp14">
   <w:p>
     <w:pPr>
-      <w:pStyle w:val="Piedepgina"/>
+      <w:pStyle w:val="Footer"/>
       <w:jc w:val="right"/>
       <w:rPr>
         <w:rFonts w:asciiTheme="majorHAnsi" w:hAnsiTheme="majorHAnsi" w:cstheme="majorHAnsi"/>
@@ -2246,7 +2329,7 @@
 <w:hdr xmlns:wpc="http://schemas.microsoft.com/office/word/2010/wordprocessingCanvas" xmlns:cx="http://schemas.microsoft.com/office/drawing/2014/chartex" xmlns:cx1="http://schemas.microsoft.com/office/drawing/2015/9/8/chartex" xmlns:cx2="http://schemas.microsoft.com/office/drawing/2015/10/21/chartex" xmlns:cx3="http://schemas.microsoft.com/office/drawing/2016/5/9/chartex" xmlns:cx4="http://schemas.microsoft.com/office/drawing/2016/5/10/chartex" xmlns:cx5="http://schemas.microsoft.com/office/drawing/2016/5/11/chartex" xmlns:cx6="http://schemas.microsoft.com/office/drawing/2016/5/12/chartex" xmlns:cx7="http://schemas.microsoft.com/office/drawing/2016/5/13/chartex" xmlns:cx8="http://schemas.microsoft.com/office/drawing/2016/5/14/chartex" xmlns:mc="http://schemas.openxmlformats.org/markup-compatibility/2006" xmlns:aink="http://schemas.microsoft.com/office/drawing/2016/ink" xmlns:am3d="http://schemas.microsoft.com/office/drawing/2017/model3d" xmlns:o="urn:schemas-microsoft-com:office:office" xmlns:oel="http://schemas.microsoft.com/office/2019/extlst" xmlns:r="http://schemas.openxmlformats.org/officeDocument/2006/relationships" xmlns:m="http://schemas.openxmlformats.org/officeDocument/2006/math" xmlns:v="urn:schemas-microsoft-com:vml" xmlns:wp14="http://schemas.microsoft.com/office/word/2010/wordprocessingDrawing" xmlns:wp="http://schemas.openxmlformats.org/drawingml/2006/wordprocessingDrawing" xmlns:w10="urn:schemas-microsoft-com:office:word" xmlns:w="http://schemas.openxmlformats.org/wordprocessingml/2006/main" xmlns:w14="http://schemas.microsoft.com/office/word/2010/wordml" xmlns:w15="http://schemas.microsoft.com/office/word/2012/wordml" xmlns:w16cex="http://schemas.microsoft.com/office/word/2018/wordml/cex" xmlns:w16cid="http://schemas.microsoft.com/office/word/2016/wordml/cid" xmlns:w16="http://schemas.microsoft.com/office/word/2018/wordml" xmlns:w16du="http://schemas.microsoft.com/office/word/2023/wordml/word16du" xmlns:w16sdtdh="http://schemas.microsoft.com/office/word/2020/wordml/sdtdatahash" xmlns:w16sdtfl="http://schemas.microsoft.com/office/word/2024/wordml/sdtformatlock" xmlns:w16se="http://schemas.microsoft.com/office/word/2015/wordml/symex" xmlns:wpg="http://schemas.microsoft.com/office/word/2010/wordprocessingGroup" xmlns:wpi="http://schemas.microsoft.com/office/word/2010/wordprocessingInk" xmlns:wne="http://schemas.microsoft.com/office/word/2006/wordml" xmlns:wps="http://schemas.microsoft.com/office/word/2010/wordprocessingShape" mc:Ignorable="w14 w15 w16se w16cid w16 w16cex w16sdtdh w16sdtfl w16du wp14">
   <w:p>
     <w:pPr>
-      <w:pStyle w:val="Encabezado"/>
+      <w:pStyle w:val="Header"/>
       <w:jc w:val="left"/>
       <w:rPr>
         <w:rFonts w:asciiTheme="majorHAnsi" w:hAnsiTheme="majorHAnsi" w:cstheme="majorHAnsi"/>
@@ -2274,7 +2357,7 @@
 <w:hdr xmlns:wpc="http://schemas.microsoft.com/office/word/2010/wordprocessingCanvas" xmlns:cx="http://schemas.microsoft.com/office/drawing/2014/chartex" xmlns:cx1="http://schemas.microsoft.com/office/drawing/2015/9/8/chartex" xmlns:cx2="http://schemas.microsoft.com/office/drawing/2015/10/21/chartex" xmlns:cx3="http://schemas.microsoft.com/office/drawing/2016/5/9/chartex" xmlns:cx4="http://schemas.microsoft.com/office/drawing/2016/5/10/chartex" xmlns:cx5="http://schemas.microsoft.com/office/drawing/2016/5/11/chartex" xmlns:cx6="http://schemas.microsoft.com/office/drawing/2016/5/12/chartex" xmlns:cx7="http://schemas.microsoft.com/office/drawing/2016/5/13/chartex" xmlns:cx8="http://schemas.microsoft.com/office/drawing/2016/5/14/chartex" xmlns:mc="http://schemas.openxmlformats.org/markup-compatibility/2006" xmlns:aink="http://schemas.microsoft.com/office/drawing/2016/ink" xmlns:am3d="http://schemas.microsoft.com/office/drawing/2017/model3d" xmlns:o="urn:schemas-microsoft-com:office:office" xmlns:oel="http://schemas.microsoft.com/office/2019/extlst" xmlns:r="http://schemas.openxmlformats.org/officeDocument/2006/relationships" xmlns:m="http://schemas.openxmlformats.org/officeDocument/2006/math" xmlns:v="urn:schemas-microsoft-com:vml" xmlns:wp14="http://schemas.microsoft.com/office/word/2010/wordprocessingDrawing" xmlns:wp="http://schemas.openxmlformats.org/drawingml/2006/wordprocessingDrawing" xmlns:w10="urn:schemas-microsoft-com:office:word" xmlns:w="http://schemas.openxmlformats.org/wordprocessingml/2006/main" xmlns:w14="http://schemas.microsoft.com/office/word/2010/wordml" xmlns:w15="http://schemas.microsoft.com/office/word/2012/wordml" xmlns:w16cex="http://schemas.microsoft.com/office/word/2018/wordml/cex" xmlns:w16cid="http://schemas.microsoft.com/office/word/2016/wordml/cid" xmlns:w16="http://schemas.microsoft.com/office/word/2018/wordml" xmlns:w16du="http://schemas.microsoft.com/office/word/2023/wordml/word16du" xmlns:w16sdtdh="http://schemas.microsoft.com/office/word/2020/wordml/sdtdatahash" xmlns:w16sdtfl="http://schemas.microsoft.com/office/word/2024/wordml/sdtformatlock" xmlns:w16se="http://schemas.microsoft.com/office/word/2015/wordml/symex" xmlns:wpg="http://schemas.microsoft.com/office/word/2010/wordprocessingGroup" xmlns:wpi="http://schemas.microsoft.com/office/word/2010/wordprocessingInk" xmlns:wne="http://schemas.microsoft.com/office/word/2006/wordml" xmlns:wps="http://schemas.microsoft.com/office/word/2010/wordprocessingShape" mc:Ignorable="w14 w15 w16se w16cid w16 w16cex w16sdtdh w16sdtfl w16du wp14">
   <w:p>
     <w:pPr>
-      <w:pStyle w:val="Encabezado"/>
+      <w:pStyle w:val="Header"/>
       <w:jc w:val="right"/>
     </w:pPr>
     <w:r>
@@ -6212,11 +6295,11 @@
       <w:color w:val="000000"/>
     </w:rPr>
   </w:style>
-  <w:style w:type="paragraph" w:styleId="Ttulo1">
+  <w:style w:type="paragraph" w:styleId="Heading1">
     <w:name w:val="heading 1"/>
     <w:basedOn w:val="Normal"/>
     <w:next w:val="Normal"/>
-    <w:link w:val="Ttulo1Car"/>
+    <w:link w:val="Heading1Char"/>
     <w:uiPriority w:val="9"/>
     <w:qFormat/>
     <w:rsid w:val="00BA06F7"/>
@@ -6234,11 +6317,11 @@
       <w:szCs w:val="32"/>
     </w:rPr>
   </w:style>
-  <w:style w:type="paragraph" w:styleId="Ttulo2">
+  <w:style w:type="paragraph" w:styleId="Heading2">
     <w:name w:val="heading 2"/>
     <w:basedOn w:val="Normal"/>
     <w:next w:val="Normal"/>
-    <w:link w:val="Ttulo2Car"/>
+    <w:link w:val="Heading2Char"/>
     <w:uiPriority w:val="9"/>
     <w:unhideWhenUsed/>
     <w:qFormat/>
@@ -6257,15 +6340,15 @@
       <w:szCs w:val="26"/>
     </w:rPr>
   </w:style>
-  <w:style w:type="paragraph" w:styleId="Ttulo3">
+  <w:style w:type="paragraph" w:styleId="Heading3">
     <w:name w:val="heading 3"/>
     <w:basedOn w:val="Normal"/>
     <w:next w:val="Normal"/>
-    <w:link w:val="Ttulo3Car"/>
+    <w:link w:val="Heading3Char"/>
     <w:uiPriority w:val="9"/>
     <w:unhideWhenUsed/>
     <w:qFormat/>
-    <w:rsid w:val="00040A1A"/>
+    <w:rsid w:val="0002746A"/>
     <w:pPr>
       <w:keepNext/>
       <w:keepLines/>
@@ -6274,16 +6357,18 @@
     </w:pPr>
     <w:rPr>
       <w:rFonts w:asciiTheme="majorHAnsi" w:eastAsiaTheme="majorEastAsia" w:hAnsiTheme="majorHAnsi" w:cstheme="majorBidi"/>
-      <w:color w:val="826600" w:themeColor="accent1" w:themeShade="7F"/>
+      <w:b/>
+      <w:color w:val="4E3434" w:themeColor="accent6" w:themeShade="80"/>
+      <w:sz w:val="28"/>
     </w:rPr>
   </w:style>
-  <w:style w:type="character" w:default="1" w:styleId="Fuentedeprrafopredeter">
+  <w:style w:type="character" w:default="1" w:styleId="DefaultParagraphFont">
     <w:name w:val="Default Paragraph Font"/>
     <w:uiPriority w:val="1"/>
     <w:semiHidden/>
     <w:unhideWhenUsed/>
   </w:style>
-  <w:style w:type="table" w:default="1" w:styleId="Tablanormal">
+  <w:style w:type="table" w:default="1" w:styleId="TableNormal">
     <w:name w:val="Normal Table"/>
     <w:uiPriority w:val="99"/>
     <w:semiHidden/>
@@ -6298,16 +6383,16 @@
       </w:tblCellMar>
     </w:tblPr>
   </w:style>
-  <w:style w:type="numbering" w:default="1" w:styleId="Sinlista">
+  <w:style w:type="numbering" w:default="1" w:styleId="NoList">
     <w:name w:val="No List"/>
     <w:uiPriority w:val="99"/>
     <w:semiHidden/>
     <w:unhideWhenUsed/>
   </w:style>
-  <w:style w:type="paragraph" w:styleId="Encabezado">
+  <w:style w:type="paragraph" w:styleId="Header">
     <w:name w:val="header"/>
     <w:basedOn w:val="Normal"/>
-    <w:link w:val="EncabezadoCar"/>
+    <w:link w:val="HeaderChar"/>
     <w:uiPriority w:val="99"/>
     <w:unhideWhenUsed/>
     <w:rsid w:val="0043636D"/>
@@ -6319,10 +6404,10 @@
       <w:spacing w:after="0" w:line="240" w:lineRule="auto"/>
     </w:pPr>
   </w:style>
-  <w:style w:type="character" w:customStyle="1" w:styleId="EncabezadoCar">
-    <w:name w:val="Encabezado Car"/>
-    <w:basedOn w:val="Fuentedeprrafopredeter"/>
-    <w:link w:val="Encabezado"/>
+  <w:style w:type="character" w:customStyle="1" w:styleId="HeaderChar">
+    <w:name w:val="Header Char"/>
+    <w:basedOn w:val="DefaultParagraphFont"/>
+    <w:link w:val="Header"/>
     <w:uiPriority w:val="99"/>
     <w:rsid w:val="0043636D"/>
     <w:rPr>
@@ -6331,10 +6416,10 @@
       <w:sz w:val="22"/>
     </w:rPr>
   </w:style>
-  <w:style w:type="paragraph" w:styleId="Piedepgina">
+  <w:style w:type="paragraph" w:styleId="Footer">
     <w:name w:val="footer"/>
     <w:basedOn w:val="Normal"/>
-    <w:link w:val="PiedepginaCar"/>
+    <w:link w:val="FooterChar"/>
     <w:uiPriority w:val="99"/>
     <w:unhideWhenUsed/>
     <w:rsid w:val="0043636D"/>
@@ -6346,10 +6431,10 @@
       <w:spacing w:after="0" w:line="240" w:lineRule="auto"/>
     </w:pPr>
   </w:style>
-  <w:style w:type="character" w:customStyle="1" w:styleId="PiedepginaCar">
-    <w:name w:val="Pie de página Car"/>
-    <w:basedOn w:val="Fuentedeprrafopredeter"/>
-    <w:link w:val="Piedepgina"/>
+  <w:style w:type="character" w:customStyle="1" w:styleId="FooterChar">
+    <w:name w:val="Footer Char"/>
+    <w:basedOn w:val="DefaultParagraphFont"/>
+    <w:link w:val="Footer"/>
     <w:uiPriority w:val="99"/>
     <w:rsid w:val="0043636D"/>
     <w:rPr>
@@ -6358,10 +6443,10 @@
       <w:sz w:val="22"/>
     </w:rPr>
   </w:style>
-  <w:style w:type="character" w:customStyle="1" w:styleId="Ttulo1Car">
-    <w:name w:val="Título 1 Car"/>
-    <w:basedOn w:val="Fuentedeprrafopredeter"/>
-    <w:link w:val="Ttulo1"/>
+  <w:style w:type="character" w:customStyle="1" w:styleId="Heading1Char">
+    <w:name w:val="Heading 1 Char"/>
+    <w:basedOn w:val="DefaultParagraphFont"/>
+    <w:link w:val="Heading1"/>
     <w:uiPriority w:val="9"/>
     <w:rsid w:val="00BA06F7"/>
     <w:rPr>
@@ -6372,7 +6457,7 @@
       <w:szCs w:val="32"/>
     </w:rPr>
   </w:style>
-  <w:style w:type="paragraph" w:styleId="Prrafodelista">
+  <w:style w:type="paragraph" w:styleId="ListParagraph">
     <w:name w:val="List Paragraph"/>
     <w:basedOn w:val="Normal"/>
     <w:uiPriority w:val="34"/>
@@ -6383,9 +6468,9 @@
       <w:contextualSpacing/>
     </w:pPr>
   </w:style>
-  <w:style w:type="character" w:styleId="Hipervnculo">
+  <w:style w:type="character" w:styleId="Hyperlink">
     <w:name w:val="Hyperlink"/>
-    <w:basedOn w:val="Fuentedeprrafopredeter"/>
+    <w:basedOn w:val="DefaultParagraphFont"/>
     <w:uiPriority w:val="99"/>
     <w:unhideWhenUsed/>
     <w:rsid w:val="00886CAE"/>
@@ -6394,9 +6479,9 @@
       <w:u w:val="single"/>
     </w:rPr>
   </w:style>
-  <w:style w:type="character" w:styleId="Mencinsinresolver">
+  <w:style w:type="character" w:styleId="UnresolvedMention">
     <w:name w:val="Unresolved Mention"/>
-    <w:basedOn w:val="Fuentedeprrafopredeter"/>
+    <w:basedOn w:val="DefaultParagraphFont"/>
     <w:uiPriority w:val="99"/>
     <w:semiHidden/>
     <w:unhideWhenUsed/>
@@ -6406,9 +6491,9 @@
       <w:shd w:val="clear" w:color="auto" w:fill="E1DFDD"/>
     </w:rPr>
   </w:style>
-  <w:style w:type="character" w:styleId="Hipervnculovisitado">
+  <w:style w:type="character" w:styleId="FollowedHyperlink">
     <w:name w:val="FollowedHyperlink"/>
-    <w:basedOn w:val="Fuentedeprrafopredeter"/>
+    <w:basedOn w:val="DefaultParagraphFont"/>
     <w:uiPriority w:val="99"/>
     <w:semiHidden/>
     <w:unhideWhenUsed/>
@@ -6418,11 +6503,11 @@
       <w:u w:val="single"/>
     </w:rPr>
   </w:style>
-  <w:style w:type="paragraph" w:styleId="Ttulo">
+  <w:style w:type="paragraph" w:styleId="Title">
     <w:name w:val="Title"/>
     <w:basedOn w:val="Normal"/>
     <w:next w:val="Normal"/>
-    <w:link w:val="TtuloCar"/>
+    <w:link w:val="TitleChar"/>
     <w:uiPriority w:val="10"/>
     <w:qFormat/>
     <w:rsid w:val="00B942D0"/>
@@ -6439,10 +6524,10 @@
       <w:szCs w:val="56"/>
     </w:rPr>
   </w:style>
-  <w:style w:type="character" w:customStyle="1" w:styleId="TtuloCar">
-    <w:name w:val="Título Car"/>
-    <w:basedOn w:val="Fuentedeprrafopredeter"/>
-    <w:link w:val="Ttulo"/>
+  <w:style w:type="character" w:customStyle="1" w:styleId="TitleChar">
+    <w:name w:val="Title Char"/>
+    <w:basedOn w:val="DefaultParagraphFont"/>
+    <w:link w:val="Title"/>
     <w:uiPriority w:val="10"/>
     <w:rsid w:val="00B942D0"/>
     <w:rPr>
@@ -6453,10 +6538,10 @@
       <w:szCs w:val="56"/>
     </w:rPr>
   </w:style>
-  <w:style w:type="character" w:customStyle="1" w:styleId="Ttulo2Car">
-    <w:name w:val="Título 2 Car"/>
-    <w:basedOn w:val="Fuentedeprrafopredeter"/>
-    <w:link w:val="Ttulo2"/>
+  <w:style w:type="character" w:customStyle="1" w:styleId="Heading2Char">
+    <w:name w:val="Heading 2 Char"/>
+    <w:basedOn w:val="DefaultParagraphFont"/>
+    <w:link w:val="Heading2"/>
     <w:uiPriority w:val="9"/>
     <w:rsid w:val="00181841"/>
     <w:rPr>
@@ -6467,7 +6552,7 @@
       <w:szCs w:val="26"/>
     </w:rPr>
   </w:style>
-  <w:style w:type="paragraph" w:styleId="Descripcin">
+  <w:style w:type="paragraph" w:styleId="Caption">
     <w:name w:val="caption"/>
     <w:basedOn w:val="Normal"/>
     <w:next w:val="Normal"/>
@@ -6486,9 +6571,9 @@
       <w:szCs w:val="18"/>
     </w:rPr>
   </w:style>
-  <w:style w:type="paragraph" w:styleId="TtuloTDC">
+  <w:style w:type="paragraph" w:styleId="TOCHeading">
     <w:name w:val="TOC Heading"/>
-    <w:basedOn w:val="Ttulo1"/>
+    <w:basedOn w:val="Heading1"/>
     <w:next w:val="Normal"/>
     <w:uiPriority w:val="39"/>
     <w:unhideWhenUsed/>
@@ -6505,7 +6590,7 @@
       <w14:ligatures w14:val="none"/>
     </w:rPr>
   </w:style>
-  <w:style w:type="paragraph" w:styleId="TDC1">
+  <w:style w:type="paragraph" w:styleId="TOC1">
     <w:name w:val="toc 1"/>
     <w:basedOn w:val="Normal"/>
     <w:next w:val="Normal"/>
@@ -6517,7 +6602,7 @@
       <w:spacing w:after="100"/>
     </w:pPr>
   </w:style>
-  <w:style w:type="paragraph" w:styleId="TDC2">
+  <w:style w:type="paragraph" w:styleId="TOC2">
     <w:name w:val="toc 2"/>
     <w:basedOn w:val="Normal"/>
     <w:next w:val="Normal"/>
@@ -6530,9 +6615,9 @@
       <w:ind w:left="220"/>
     </w:pPr>
   </w:style>
-  <w:style w:type="table" w:styleId="Tablaconcuadrcula">
+  <w:style w:type="table" w:styleId="TableGrid">
     <w:name w:val="Table Grid"/>
-    <w:basedOn w:val="Tablanormal"/>
+    <w:basedOn w:val="TableNormal"/>
     <w:uiPriority w:val="39"/>
     <w:rsid w:val="00E669DE"/>
     <w:pPr>
@@ -6549,9 +6634,9 @@
       </w:tblBorders>
     </w:tblPr>
   </w:style>
-  <w:style w:type="table" w:styleId="Tablaconcuadrcula4-nfasis6">
+  <w:style w:type="table" w:styleId="GridTable4-Accent6">
     <w:name w:val="Grid Table 4 Accent 6"/>
-    <w:basedOn w:val="Tablanormal"/>
+    <w:basedOn w:val="TableNormal"/>
     <w:uiPriority w:val="49"/>
     <w:rsid w:val="00E669DE"/>
     <w:pPr>
@@ -6625,9 +6710,9 @@
       </w:tcPr>
     </w:tblStylePr>
   </w:style>
-  <w:style w:type="table" w:styleId="Tabladelista3-nfasis3">
+  <w:style w:type="table" w:styleId="ListTable3-Accent3">
     <w:name w:val="List Table 3 Accent 3"/>
-    <w:basedOn w:val="Tablanormal"/>
+    <w:basedOn w:val="TableNormal"/>
     <w:uiPriority w:val="48"/>
     <w:rsid w:val="00AC07E0"/>
     <w:pPr>
@@ -6749,9 +6834,9 @@
       </w:tcPr>
     </w:tblStylePr>
   </w:style>
-  <w:style w:type="table" w:styleId="Tabladelista3-nfasis6">
+  <w:style w:type="table" w:styleId="ListTable3-Accent6">
     <w:name w:val="List Table 3 Accent 6"/>
-    <w:basedOn w:val="Tablanormal"/>
+    <w:basedOn w:val="TableNormal"/>
     <w:uiPriority w:val="48"/>
     <w:rsid w:val="00AC07E0"/>
     <w:pPr>
@@ -6873,9 +6958,9 @@
       </w:tcPr>
     </w:tblStylePr>
   </w:style>
-  <w:style w:type="table" w:styleId="Tabladelista4-nfasis3">
+  <w:style w:type="table" w:styleId="ListTable4-Accent3">
     <w:name w:val="List Table 4 Accent 3"/>
-    <w:basedOn w:val="Tablanormal"/>
+    <w:basedOn w:val="TableNormal"/>
     <w:uiPriority w:val="49"/>
     <w:rsid w:val="00AC07E0"/>
     <w:pPr>
@@ -6947,9 +7032,9 @@
       </w:tcPr>
     </w:tblStylePr>
   </w:style>
-  <w:style w:type="table" w:styleId="Tabladelista4-nfasis2">
+  <w:style w:type="table" w:styleId="ListTable4-Accent2">
     <w:name w:val="List Table 4 Accent 2"/>
-    <w:basedOn w:val="Tablanormal"/>
+    <w:basedOn w:val="TableNormal"/>
     <w:uiPriority w:val="49"/>
     <w:rsid w:val="00AC07E0"/>
     <w:pPr>
@@ -7021,9 +7106,9 @@
       </w:tcPr>
     </w:tblStylePr>
   </w:style>
-  <w:style w:type="table" w:styleId="Tabladelista4-nfasis5">
+  <w:style w:type="table" w:styleId="ListTable4-Accent5">
     <w:name w:val="List Table 4 Accent 5"/>
-    <w:basedOn w:val="Tablanormal"/>
+    <w:basedOn w:val="TableNormal"/>
     <w:uiPriority w:val="49"/>
     <w:rsid w:val="00AC07E0"/>
     <w:pPr>
@@ -7095,9 +7180,9 @@
       </w:tcPr>
     </w:tblStylePr>
   </w:style>
-  <w:style w:type="table" w:styleId="Tablaconcuadrcula5oscura-nfasis6">
+  <w:style w:type="table" w:styleId="GridTable5Dark-Accent6">
     <w:name w:val="Grid Table 5 Dark Accent 6"/>
-    <w:basedOn w:val="Tablanormal"/>
+    <w:basedOn w:val="TableNormal"/>
     <w:uiPriority w:val="50"/>
     <w:rsid w:val="00AC07E0"/>
     <w:pPr>
@@ -7201,9 +7286,9 @@
       </w:tcPr>
     </w:tblStylePr>
   </w:style>
-  <w:style w:type="character" w:styleId="Textodelmarcadordeposicin">
+  <w:style w:type="character" w:styleId="PlaceholderText">
     <w:name w:val="Placeholder Text"/>
-    <w:basedOn w:val="Fuentedeprrafopredeter"/>
+    <w:basedOn w:val="DefaultParagraphFont"/>
     <w:uiPriority w:val="99"/>
     <w:semiHidden/>
     <w:rsid w:val="00242D0F"/>
@@ -7229,12 +7314,12 @@
   </w:style>
   <w:style w:type="character" w:customStyle="1" w:styleId="url">
     <w:name w:val="url"/>
-    <w:basedOn w:val="Fuentedeprrafopredeter"/>
+    <w:basedOn w:val="DefaultParagraphFont"/>
     <w:rsid w:val="0065125D"/>
   </w:style>
-  <w:style w:type="character" w:styleId="Fuerte">
+  <w:style w:type="character" w:styleId="Strong">
     <w:name w:val="Strong"/>
-    <w:basedOn w:val="Fuentedeprrafopredeter"/>
+    <w:basedOn w:val="DefaultParagraphFont"/>
     <w:uiPriority w:val="22"/>
     <w:qFormat/>
     <w:rsid w:val="002364E4"/>
@@ -7243,20 +7328,22 @@
       <w:bCs/>
     </w:rPr>
   </w:style>
-  <w:style w:type="character" w:customStyle="1" w:styleId="Ttulo3Car">
-    <w:name w:val="Título 3 Car"/>
-    <w:basedOn w:val="Fuentedeprrafopredeter"/>
-    <w:link w:val="Ttulo3"/>
+  <w:style w:type="character" w:customStyle="1" w:styleId="Heading3Char">
+    <w:name w:val="Heading 3 Char"/>
+    <w:basedOn w:val="DefaultParagraphFont"/>
+    <w:link w:val="Heading3"/>
     <w:uiPriority w:val="9"/>
-    <w:rsid w:val="00040A1A"/>
+    <w:rsid w:val="0002746A"/>
     <w:rPr>
       <w:rFonts w:asciiTheme="majorHAnsi" w:eastAsiaTheme="majorEastAsia" w:hAnsiTheme="majorHAnsi" w:cstheme="majorBidi"/>
-      <w:color w:val="826600" w:themeColor="accent1" w:themeShade="7F"/>
+      <w:b/>
+      <w:color w:val="4E3434" w:themeColor="accent6" w:themeShade="80"/>
+      <w:sz w:val="28"/>
     </w:rPr>
   </w:style>
-  <w:style w:type="character" w:styleId="Refdecomentario">
+  <w:style w:type="character" w:styleId="CommentReference">
     <w:name w:val="annotation reference"/>
-    <w:basedOn w:val="Fuentedeprrafopredeter"/>
+    <w:basedOn w:val="DefaultParagraphFont"/>
     <w:uiPriority w:val="99"/>
     <w:semiHidden/>
     <w:unhideWhenUsed/>
@@ -7266,10 +7353,10 @@
       <w:szCs w:val="16"/>
     </w:rPr>
   </w:style>
-  <w:style w:type="paragraph" w:styleId="Textocomentario">
+  <w:style w:type="paragraph" w:styleId="CommentText">
     <w:name w:val="annotation text"/>
     <w:basedOn w:val="Normal"/>
-    <w:link w:val="TextocomentarioCar"/>
+    <w:link w:val="CommentTextChar"/>
     <w:uiPriority w:val="99"/>
     <w:unhideWhenUsed/>
     <w:rsid w:val="00880E38"/>
@@ -7281,10 +7368,10 @@
       <w:szCs w:val="20"/>
     </w:rPr>
   </w:style>
-  <w:style w:type="character" w:customStyle="1" w:styleId="TextocomentarioCar">
-    <w:name w:val="Texto comentario Car"/>
-    <w:basedOn w:val="Fuentedeprrafopredeter"/>
-    <w:link w:val="Textocomentario"/>
+  <w:style w:type="character" w:customStyle="1" w:styleId="CommentTextChar">
+    <w:name w:val="Comment Text Char"/>
+    <w:basedOn w:val="DefaultParagraphFont"/>
+    <w:link w:val="CommentText"/>
     <w:uiPriority w:val="99"/>
     <w:rsid w:val="00880E38"/>
     <w:rPr>
@@ -7294,11 +7381,11 @@
       <w:szCs w:val="20"/>
     </w:rPr>
   </w:style>
-  <w:style w:type="paragraph" w:styleId="Asuntodelcomentario">
+  <w:style w:type="paragraph" w:styleId="CommentSubject">
     <w:name w:val="annotation subject"/>
-    <w:basedOn w:val="Textocomentario"/>
-    <w:next w:val="Textocomentario"/>
-    <w:link w:val="AsuntodelcomentarioCar"/>
+    <w:basedOn w:val="CommentText"/>
+    <w:next w:val="CommentText"/>
+    <w:link w:val="CommentSubjectChar"/>
     <w:uiPriority w:val="99"/>
     <w:semiHidden/>
     <w:unhideWhenUsed/>
@@ -7308,10 +7395,10 @@
       <w:bCs/>
     </w:rPr>
   </w:style>
-  <w:style w:type="character" w:customStyle="1" w:styleId="AsuntodelcomentarioCar">
-    <w:name w:val="Asunto del comentario Car"/>
-    <w:basedOn w:val="TextocomentarioCar"/>
-    <w:link w:val="Asuntodelcomentario"/>
+  <w:style w:type="character" w:customStyle="1" w:styleId="CommentSubjectChar">
+    <w:name w:val="Comment Subject Char"/>
+    <w:basedOn w:val="CommentTextChar"/>
+    <w:link w:val="CommentSubject"/>
     <w:uiPriority w:val="99"/>
     <w:semiHidden/>
     <w:rsid w:val="00880E38"/>
@@ -7324,9 +7411,9 @@
       <w:szCs w:val="20"/>
     </w:rPr>
   </w:style>
-  <w:style w:type="character" w:styleId="nfasis">
+  <w:style w:type="character" w:styleId="Emphasis">
     <w:name w:val="Emphasis"/>
-    <w:basedOn w:val="Fuentedeprrafopredeter"/>
+    <w:basedOn w:val="DefaultParagraphFont"/>
     <w:uiPriority w:val="20"/>
     <w:qFormat/>
     <w:rsid w:val="00123D67"/>

</xml_diff>